<commit_message>
Deploying to gh-pages from @ Morrison-Lab/psw@b533f3c7a259036509bdcba01416c3a5e6f1bcb9 🚀
</commit_message>
<xml_diff>
--- a/chapters/word-choice.docx
+++ b/chapters/word-choice.docx
@@ -15,7 +15,7 @@
         <w:pStyle w:val="Date"/>
       </w:pPr>
       <w:r>
-        <w:t xml:space="preserve">Last modified: 2026-10-05 08:53:46 (UTC)</w:t>
+        <w:t xml:space="preserve">Last modified: 2026-10-05 09:01:55 (UTC)</w:t>
       </w:r>
     </w:p>
     <w:tbl>
@@ -521,7 +521,7 @@
         <w:t xml:space="preserve">and the relatively-recent hybridization of the English language.</w:t>
       </w:r>
     </w:p>
-    <w:bookmarkStart w:id="16" w:name="avoid-vague-and-metaphorical-language"/>
+    <w:bookmarkStart w:id="17" w:name="avoid-vague-and-metaphorical-language"/>
     <w:p>
       <w:pPr>
         <w:pStyle w:val="Heading2"/>
@@ -851,9 +851,32 @@
       <w:r>
         <w:t xml:space="preserve">state the claim.</w:t>
       </w:r>
+      <w:r>
+        <w:t xml:space="preserve"> </w:t>
+      </w:r>
+      <w:hyperlink r:id="rId16">
+        <w:r>
+          <w:rPr>
+            <w:rStyle w:val="Hyperlink"/>
+          </w:rPr>
+          <w:t xml:space="preserve">Use literal language</w:t>
+        </w:r>
+      </w:hyperlink>
+      <w:r>
+        <w:t xml:space="preserve"> </w:t>
+      </w:r>
+      <w:r>
+        <w:t xml:space="preserve">explains why idioms exclude some readers,</w:t>
+      </w:r>
+      <w:r>
+        <w:t xml:space="preserve"> </w:t>
+      </w:r>
+      <w:r>
+        <w:t xml:space="preserve">and gives more examples.</w:t>
+      </w:r>
     </w:p>
-    <w:bookmarkEnd w:id="16"/>
-    <w:bookmarkStart w:id="17" w:name="say-which-thing"/>
+    <w:bookmarkEnd w:id="17"/>
+    <w:bookmarkStart w:id="18" w:name="say-which-thing"/>
     <w:p>
       <w:pPr>
         <w:pStyle w:val="Heading2"/>
@@ -908,8 +931,8 @@
         <w:t xml:space="preserve">✅ Check the residuals first.</w:t>
       </w:r>
     </w:p>
-    <w:bookmarkEnd w:id="17"/>
-    <w:bookmarkStart w:id="20" w:name="minimize-unnecessary-jargon"/>
+    <w:bookmarkEnd w:id="18"/>
+    <w:bookmarkStart w:id="21" w:name="minimize-unnecessary-jargon"/>
     <w:p>
       <w:pPr>
         <w:pStyle w:val="Heading2"/>
@@ -1020,7 +1043,7 @@
       <w:r>
         <w:t xml:space="preserve"> </w:t>
       </w:r>
-      <w:hyperlink r:id="rId18">
+      <w:hyperlink r:id="rId19">
         <w:r>
           <w:rPr>
             <w:rStyle w:val="Hyperlink"/>
@@ -1032,7 +1055,7 @@
         <w:t xml:space="preserve">).</w:t>
       </w:r>
     </w:p>
-    <w:bookmarkStart w:id="19" w:name="exm-jargon"/>
+    <w:bookmarkStart w:id="20" w:name="exm-jargon"/>
     <w:p>
       <w:pPr>
         <w:pStyle w:val="BodyText"/>
@@ -1081,7 +1104,7 @@
         <w:t xml:space="preserve">and it states what was actually done.</w:t>
       </w:r>
     </w:p>
-    <w:bookmarkEnd w:id="19"/>
+    <w:bookmarkEnd w:id="20"/>
     <w:p>
       <w:pPr>
         <w:pStyle w:val="BodyText"/>
@@ -1120,7 +1143,7 @@
         <w:t xml:space="preserve">define it clearly at first use.</w:t>
       </w:r>
     </w:p>
-    <w:bookmarkEnd w:id="20"/>
+    <w:bookmarkEnd w:id="21"/>
     <w:sectPr>
       <w:footnotePr>
         <w:numRestart w:val="eachSect"/>

</xml_diff>

<commit_message>
Deploying to gh-pages from @ Morrison-Lab/psw@eed70e94929bc1933a000ba5880b57c9137f5264 🚀
</commit_message>
<xml_diff>
--- a/chapters/word-choice.docx
+++ b/chapters/word-choice.docx
@@ -15,7 +15,7 @@
         <w:pStyle w:val="Date"/>
       </w:pPr>
       <w:r>
-        <w:t xml:space="preserve">Last modified: 2026-10-05 09:20:22 (UTC)</w:t>
+        <w:t xml:space="preserve">Last modified: 2026-10-05 09:45:39 (UTC)</w:t>
       </w:r>
     </w:p>
     <w:tbl>
@@ -876,13 +876,149 @@
       </w:r>
     </w:p>
     <w:bookmarkEnd w:id="17"/>
-    <w:bookmarkStart w:id="18" w:name="say-which-thing"/>
+    <w:bookmarkStart w:id="18" w:name="Xb7f284656303a61435fb977954db81f2a003d22"/>
     <w:p>
       <w:pPr>
         <w:pStyle w:val="Heading2"/>
       </w:pPr>
       <w:r>
-        <w:t xml:space="preserve">2 Say which thing</w:t>
+        <w:t xml:space="preserve">2 Follow an abstract statement with an example</w:t>
+      </w:r>
+    </w:p>
+    <w:p>
+      <w:pPr>
+        <w:pStyle w:val="FirstParagraph"/>
+      </w:pPr>
+      <w:r>
+        <w:t xml:space="preserve">An abstract or general statement is fine,</w:t>
+      </w:r>
+      <w:r>
+        <w:t xml:space="preserve"> </w:t>
+      </w:r>
+      <w:r>
+        <w:t xml:space="preserve">as long as a concrete example follows it.</w:t>
+      </w:r>
+      <w:r>
+        <w:t xml:space="preserve"> </w:t>
+      </w:r>
+      <w:r>
+        <w:t xml:space="preserve">A vague statement is not:</w:t>
+      </w:r>
+      <w:r>
+        <w:t xml:space="preserve"> </w:t>
+      </w:r>
+      <w:r>
+        <w:t xml:space="preserve">one that names no specific case leaves the reader to invent one,</w:t>
+      </w:r>
+      <w:r>
+        <w:t xml:space="preserve"> </w:t>
+      </w:r>
+      <w:r>
+        <w:t xml:space="preserve">and they may invent the wrong one.</w:t>
+      </w:r>
+    </w:p>
+    <w:p>
+      <w:pPr>
+        <w:pStyle w:val="BodyText"/>
+      </w:pPr>
+      <w:r>
+        <w:t xml:space="preserve">For example, consider this bullet from a list of what machine learning needs:</w:t>
+      </w:r>
+    </w:p>
+    <w:p>
+      <w:pPr>
+        <w:pStyle w:val="BlockText"/>
+      </w:pPr>
+      <w:r>
+        <w:t xml:space="preserve">statistics to say what a finite sample of data supports</w:t>
+      </w:r>
+    </w:p>
+    <w:p>
+      <w:pPr>
+        <w:pStyle w:val="FirstParagraph"/>
+      </w:pPr>
+      <w:r>
+        <w:t xml:space="preserve">The bullet is general, which is fine.</w:t>
+      </w:r>
+      <w:r>
+        <w:t xml:space="preserve"> </w:t>
+      </w:r>
+      <w:r>
+        <w:t xml:space="preserve">What it lacks is an instance that shows the reader what</w:t>
+      </w:r>
+      <w:r>
+        <w:t xml:space="preserve"> </w:t>
+      </w:r>
+      <w:r>
+        <w:t xml:space="preserve">“supports”</w:t>
+      </w:r>
+      <w:r>
+        <w:t xml:space="preserve"> </w:t>
+      </w:r>
+      <w:r>
+        <w:t xml:space="preserve">means.</w:t>
+      </w:r>
+      <w:r>
+        <w:t xml:space="preserve"> </w:t>
+      </w:r>
+      <w:r>
+        <w:t xml:space="preserve">Adding one turns it into something a reader can check:</w:t>
+      </w:r>
+    </w:p>
+    <w:p>
+      <w:pPr>
+        <w:pStyle w:val="BlockText"/>
+      </w:pPr>
+      <w:r>
+        <w:t xml:space="preserve">statistics to say what a finite sample of data supports:</w:t>
+      </w:r>
+      <w:r>
+        <w:t xml:space="preserve"> </w:t>
+      </w:r>
+      <w:r>
+        <w:t xml:space="preserve">if most of the spam in a pile of training emails mentions money,</w:t>
+      </w:r>
+      <w:r>
+        <w:t xml:space="preserve"> </w:t>
+      </w:r>
+      <w:r>
+        <w:t xml:space="preserve">statistics tells us whether that pattern should hold for next month’s emails</w:t>
+      </w:r>
+      <w:r>
+        <w:t xml:space="preserve"> </w:t>
+      </w:r>
+      <w:r>
+        <w:t xml:space="preserve">or is a quirk of this particular pile</w:t>
+      </w:r>
+    </w:p>
+    <w:p>
+      <w:pPr>
+        <w:pStyle w:val="FirstParagraph"/>
+      </w:pPr>
+      <w:r>
+        <w:t xml:space="preserve">When you write a general claim,</w:t>
+      </w:r>
+      <w:r>
+        <w:t xml:space="preserve"> </w:t>
+      </w:r>
+      <w:r>
+        <w:t xml:space="preserve">ask what one specific case of it looks like,</w:t>
+      </w:r>
+      <w:r>
+        <w:t xml:space="preserve"> </w:t>
+      </w:r>
+      <w:r>
+        <w:t xml:space="preserve">and put that case right after the claim.</w:t>
+      </w:r>
+    </w:p>
+    <w:bookmarkEnd w:id="18"/>
+    <w:bookmarkStart w:id="19" w:name="say-which-thing"/>
+    <w:p>
+      <w:pPr>
+        <w:pStyle w:val="Heading2"/>
+      </w:pPr>
+      <w:r>
+        <w:t xml:space="preserve">3 Say which thing</w:t>
       </w:r>
     </w:p>
     <w:p>
@@ -931,14 +1067,14 @@
         <w:t xml:space="preserve">✅ Check the residuals first.</w:t>
       </w:r>
     </w:p>
-    <w:bookmarkEnd w:id="18"/>
-    <w:bookmarkStart w:id="21" w:name="minimize-unnecessary-jargon"/>
+    <w:bookmarkEnd w:id="19"/>
+    <w:bookmarkStart w:id="22" w:name="minimize-unnecessary-jargon"/>
     <w:p>
       <w:pPr>
         <w:pStyle w:val="Heading2"/>
       </w:pPr>
       <w:r>
-        <w:t xml:space="preserve">3 Minimize unnecessary jargon</w:t>
+        <w:t xml:space="preserve">4 Minimize unnecessary jargon</w:t>
       </w:r>
     </w:p>
     <w:p>
@@ -1043,7 +1179,7 @@
       <w:r>
         <w:t xml:space="preserve"> </w:t>
       </w:r>
-      <w:hyperlink r:id="rId19">
+      <w:hyperlink r:id="rId20">
         <w:r>
           <w:rPr>
             <w:rStyle w:val="Hyperlink"/>
@@ -1055,7 +1191,7 @@
         <w:t xml:space="preserve">).</w:t>
       </w:r>
     </w:p>
-    <w:bookmarkStart w:id="20" w:name="exm-jargon"/>
+    <w:bookmarkStart w:id="21" w:name="exm-jargon"/>
     <w:p>
       <w:pPr>
         <w:pStyle w:val="BodyText"/>
@@ -1104,7 +1240,7 @@
         <w:t xml:space="preserve">and it states what was actually done.</w:t>
       </w:r>
     </w:p>
-    <w:bookmarkEnd w:id="20"/>
+    <w:bookmarkEnd w:id="21"/>
     <w:p>
       <w:pPr>
         <w:pStyle w:val="BodyText"/>
@@ -1143,7 +1279,7 @@
         <w:t xml:space="preserve">define it clearly at first use.</w:t>
       </w:r>
     </w:p>
-    <w:bookmarkEnd w:id="21"/>
+    <w:bookmarkEnd w:id="22"/>
     <w:sectPr>
       <w:footnotePr>
         <w:numRestart w:val="eachSect"/>

</xml_diff>

<commit_message>
Deploying to gh-pages from @ Morrison-Lab/psw@2cce41c7ac5c7c2b3303282c18d513357691e578 🚀
</commit_message>
<xml_diff>
--- a/chapters/word-choice.docx
+++ b/chapters/word-choice.docx
@@ -15,7 +15,7 @@
         <w:pStyle w:val="Date"/>
       </w:pPr>
       <w:r>
-        <w:t xml:space="preserve">Last modified: 2026-10-05 17:47:49 (UTC)</w:t>
+        <w:t xml:space="preserve">Last modified: 2026-10-05 17:53:18 (UTC)</w:t>
       </w:r>
     </w:p>
     <w:tbl>
@@ -521,7 +521,7 @@
         <w:t xml:space="preserve">and the relatively-recent hybridization of the English language.</w:t>
       </w:r>
     </w:p>
-    <w:bookmarkStart w:id="17" w:name="avoid-vague-and-metaphorical-language"/>
+    <w:bookmarkStart w:id="18" w:name="avoid-vague-and-metaphorical-language"/>
     <w:p>
       <w:pPr>
         <w:pStyle w:val="Heading2"/>
@@ -875,8 +875,84 @@
         <w:t xml:space="preserve">and gives more examples.</w:t>
       </w:r>
     </w:p>
-    <w:bookmarkEnd w:id="17"/>
-    <w:bookmarkStart w:id="18" w:name="Xb7f284656303a61435fb977954db81f2a003d22"/>
+    <w:p>
+      <w:pPr>
+        <w:pStyle w:val="BodyText"/>
+      </w:pPr>
+      <w:r>
+        <w:t xml:space="preserve">Some single words cause a different problem.</w:t>
+      </w:r>
+      <w:r>
+        <w:t xml:space="preserve"> </w:t>
+      </w:r>
+      <w:r>
+        <w:t xml:space="preserve">Words such as</w:t>
+      </w:r>
+      <w:r>
+        <w:t xml:space="preserve"> </w:t>
+      </w:r>
+      <w:r>
+        <w:t xml:space="preserve">“obviously”</w:t>
+      </w:r>
+      <w:r>
+        <w:t xml:space="preserve">,</w:t>
+      </w:r>
+      <w:r>
+        <w:t xml:space="preserve"> </w:t>
+      </w:r>
+      <w:r>
+        <w:t xml:space="preserve">“clearly”</w:t>
+      </w:r>
+      <w:r>
+        <w:t xml:space="preserve"> </w:t>
+      </w:r>
+      <w:r>
+        <w:t xml:space="preserve">and</w:t>
+      </w:r>
+      <w:r>
+        <w:t xml:space="preserve"> </w:t>
+      </w:r>
+      <w:r>
+        <w:t xml:space="preserve">“trivially”</w:t>
+      </w:r>
+      <w:r>
+        <w:t xml:space="preserve"> </w:t>
+      </w:r>
+      <w:r>
+        <w:t xml:space="preserve">can assert that a claim needs no support</w:t>
+      </w:r>
+      <w:r>
+        <w:t xml:space="preserve"> </w:t>
+      </w:r>
+      <w:r>
+        <w:t xml:space="preserve">instead of supplying any.</w:t>
+      </w:r>
+      <w:r>
+        <w:t xml:space="preserve"> </w:t>
+      </w:r>
+      <w:hyperlink r:id="rId17">
+        <w:r>
+          <w:rPr>
+            <w:rStyle w:val="Hyperlink"/>
+          </w:rPr>
+          <w:t xml:space="preserve">Do not substitute flippancy for support</w:t>
+        </w:r>
+      </w:hyperlink>
+      <w:r>
+        <w:t xml:space="preserve"> </w:t>
+      </w:r>
+      <w:r>
+        <w:t xml:space="preserve">says when those words are a problem</w:t>
+      </w:r>
+      <w:r>
+        <w:t xml:space="preserve"> </w:t>
+      </w:r>
+      <w:r>
+        <w:t xml:space="preserve">and what to write instead.</w:t>
+      </w:r>
+    </w:p>
+    <w:bookmarkEnd w:id="18"/>
+    <w:bookmarkStart w:id="19" w:name="Xb7f284656303a61435fb977954db81f2a003d22"/>
     <w:p>
       <w:pPr>
         <w:pStyle w:val="Heading2"/>
@@ -1011,8 +1087,8 @@
         <w:t xml:space="preserve">and put that case right after the claim.</w:t>
       </w:r>
     </w:p>
-    <w:bookmarkEnd w:id="18"/>
-    <w:bookmarkStart w:id="19" w:name="say-which-thing"/>
+    <w:bookmarkEnd w:id="19"/>
+    <w:bookmarkStart w:id="20" w:name="say-which-thing"/>
     <w:p>
       <w:pPr>
         <w:pStyle w:val="Heading2"/>
@@ -1067,8 +1143,8 @@
         <w:t xml:space="preserve">✅ Check the residuals first.</w:t>
       </w:r>
     </w:p>
-    <w:bookmarkEnd w:id="19"/>
-    <w:bookmarkStart w:id="22" w:name="minimize-unnecessary-jargon"/>
+    <w:bookmarkEnd w:id="20"/>
+    <w:bookmarkStart w:id="23" w:name="minimize-unnecessary-jargon"/>
     <w:p>
       <w:pPr>
         <w:pStyle w:val="Heading2"/>
@@ -1179,7 +1255,7 @@
       <w:r>
         <w:t xml:space="preserve"> </w:t>
       </w:r>
-      <w:hyperlink r:id="rId20">
+      <w:hyperlink r:id="rId21">
         <w:r>
           <w:rPr>
             <w:rStyle w:val="Hyperlink"/>
@@ -1191,7 +1267,7 @@
         <w:t xml:space="preserve">).</w:t>
       </w:r>
     </w:p>
-    <w:bookmarkStart w:id="21" w:name="exm-jargon"/>
+    <w:bookmarkStart w:id="22" w:name="exm-jargon"/>
     <w:p>
       <w:pPr>
         <w:pStyle w:val="BodyText"/>
@@ -1240,7 +1316,7 @@
         <w:t xml:space="preserve">and it states what was actually done.</w:t>
       </w:r>
     </w:p>
-    <w:bookmarkEnd w:id="21"/>
+    <w:bookmarkEnd w:id="22"/>
     <w:p>
       <w:pPr>
         <w:pStyle w:val="BodyText"/>
@@ -1279,7 +1355,7 @@
         <w:t xml:space="preserve">define it clearly at first use.</w:t>
       </w:r>
     </w:p>
-    <w:bookmarkEnd w:id="22"/>
+    <w:bookmarkEnd w:id="23"/>
     <w:sectPr>
       <w:footnotePr>
         <w:numRestart w:val="eachSect"/>

</xml_diff>

<commit_message>
Deploying to gh-pages from @ Morrison-Lab/psw@94816a527b45c361de08baa18baab8fbd66ac32b 🚀
</commit_message>
<xml_diff>
--- a/chapters/word-choice.docx
+++ b/chapters/word-choice.docx
@@ -15,7 +15,7 @@
         <w:pStyle w:val="Date"/>
       </w:pPr>
       <w:r>
-        <w:t xml:space="preserve">Last modified: 2026-10-12 22:48:38 (PDT)</w:t>
+        <w:t xml:space="preserve">Last modified: 2026-10-13 00:05:34 (PDT)</w:t>
       </w:r>
     </w:p>
     <w:tbl>
@@ -1239,6 +1239,92 @@
       </w:pPr>
       <w:r>
         <w:t xml:space="preserve">✅ Check the residuals first.</w:t>
+      </w:r>
+    </w:p>
+    <w:p>
+      <w:pPr>
+        <w:pStyle w:val="FirstParagraph"/>
+      </w:pPr>
+      <w:r>
+        <w:t xml:space="preserve">The plural and the filler phrases built on it</w:t>
+      </w:r>
+      <w:r>
+        <w:t xml:space="preserve"> </w:t>
+      </w:r>
+      <w:r>
+        <w:t xml:space="preserve">(</w:t>
+      </w:r>
+      <w:r>
+        <w:t xml:space="preserve">“a number of things”</w:t>
+      </w:r>
+      <w:r>
+        <w:t xml:space="preserve">,</w:t>
+      </w:r>
+      <w:r>
+        <w:t xml:space="preserve"> </w:t>
+      </w:r>
+      <w:r>
+        <w:t xml:space="preserve">“other things”</w:t>
+      </w:r>
+      <w:r>
+        <w:t xml:space="preserve">,</w:t>
+      </w:r>
+      <w:r>
+        <w:t xml:space="preserve"> </w:t>
+      </w:r>
+      <w:r>
+        <w:t xml:space="preserve">“things like that”</w:t>
+      </w:r>
+      <w:r>
+        <w:t xml:space="preserve">)</w:t>
+      </w:r>
+      <w:r>
+        <w:t xml:space="preserve"> </w:t>
+      </w:r>
+      <w:r>
+        <w:t xml:space="preserve">are the same problem.</w:t>
+      </w:r>
+      <w:r>
+        <w:t xml:space="preserve"> </w:t>
+      </w:r>
+      <w:r>
+        <w:t xml:space="preserve">Each one tells the reader that something exists</w:t>
+      </w:r>
+      <w:r>
+        <w:t xml:space="preserve"> </w:t>
+      </w:r>
+      <w:r>
+        <w:t xml:space="preserve">without saying what.</w:t>
+      </w:r>
+    </w:p>
+    <w:p>
+      <w:pPr>
+        <w:pStyle w:val="BlockText"/>
+      </w:pPr>
+      <w:r>
+        <w:t xml:space="preserve">❌ Several things can inflate the standard errors.</w:t>
+      </w:r>
+    </w:p>
+    <w:p>
+      <w:pPr>
+        <w:pStyle w:val="BlockText"/>
+      </w:pPr>
+      <w:r>
+        <w:t xml:space="preserve">✅ Correlated predictors and clustered observations can inflate the standard errors.</w:t>
+      </w:r>
+    </w:p>
+    <w:p>
+      <w:pPr>
+        <w:pStyle w:val="FirstParagraph"/>
+      </w:pPr>
+      <w:r>
+        <w:t xml:space="preserve">If you cannot name the object, quantity, step or idea,</w:t>
+      </w:r>
+      <w:r>
+        <w:t xml:space="preserve"> </w:t>
+      </w:r>
+      <w:r>
+        <w:t xml:space="preserve">the sentence is not yet ready to write.</w:t>
       </w:r>
     </w:p>
     <w:bookmarkEnd w:id="22"/>

</xml_diff>

<commit_message>
Deploying to gh-pages from @ Morrison-Lab/psw@3fef0f09ef16a769654e7628b86321f6b63ddf17 🚀
</commit_message>
<xml_diff>
--- a/chapters/word-choice.docx
+++ b/chapters/word-choice.docx
@@ -15,7 +15,7 @@
         <w:pStyle w:val="Date"/>
       </w:pPr>
       <w:r>
-        <w:t xml:space="preserve">Last modified: 2026-10-14 08:02:01 (PDT)</w:t>
+        <w:t xml:space="preserve">Last modified: 2026-10-14 13:15:37 (PDT)</w:t>
       </w:r>
     </w:p>
     <w:tbl>
@@ -976,6 +976,150 @@
     <w:p>
       <w:pPr>
         <w:pStyle w:val="BodyText"/>
+      </w:pPr>
+      <w:r>
+        <w:t xml:space="preserve">Money words are idioms too when no money is involved.</w:t>
+      </w:r>
+      <w:r>
+        <w:t xml:space="preserve"> </w:t>
+      </w:r>
+      <w:r>
+        <w:t xml:space="preserve">“Costs us”</w:t>
+      </w:r>
+      <w:r>
+        <w:t xml:space="preserve">,</w:t>
+      </w:r>
+      <w:r>
+        <w:t xml:space="preserve"> </w:t>
+      </w:r>
+      <w:r>
+        <w:t xml:space="preserve">“buys us”</w:t>
+      </w:r>
+      <w:r>
+        <w:t xml:space="preserve"> </w:t>
+      </w:r>
+      <w:r>
+        <w:t xml:space="preserve">and</w:t>
+      </w:r>
+      <w:r>
+        <w:t xml:space="preserve"> </w:t>
+      </w:r>
+      <w:r>
+        <w:t xml:space="preserve">“at the price of”</w:t>
+      </w:r>
+      <w:r>
+        <w:t xml:space="preserve"> </w:t>
+      </w:r>
+      <w:r>
+        <w:t xml:space="preserve">borrow from commerce</w:t>
+      </w:r>
+      <w:r>
+        <w:t xml:space="preserve"> </w:t>
+      </w:r>
+      <w:r>
+        <w:t xml:space="preserve">to describe a trade-off, and the reader must translate them back.</w:t>
+      </w:r>
+      <w:r>
+        <w:t xml:space="preserve"> </w:t>
+      </w:r>
+      <w:r>
+        <w:t xml:space="preserve">Say what is lost or gained.</w:t>
+      </w:r>
+      <w:r>
+        <w:t xml:space="preserve"> </w:t>
+      </w:r>
+      <w:r>
+        <w:t xml:space="preserve">Keep a literal use:</w:t>
+      </w:r>
+      <w:r>
+        <w:t xml:space="preserve"> </w:t>
+      </w:r>
+      <w:r>
+        <w:t xml:space="preserve">a computational cost, a monetary cost,</w:t>
+      </w:r>
+      <w:r>
+        <w:t xml:space="preserve"> </w:t>
+      </w:r>
+      <w:r>
+        <w:t xml:space="preserve">or a cost function that the text defines as a term.</w:t>
+      </w:r>
+    </w:p>
+    <w:p>
+      <w:pPr>
+        <w:pStyle w:val="BlockText"/>
+      </w:pPr>
+      <w:r>
+        <w:t xml:space="preserve">❌ Nesting the cross-validation loop costs another factor of</w:t>
+      </w:r>
+      <w:r>
+        <w:t xml:space="preserve"> </w:t>
+      </w:r>
+      <m:oMath>
+        <m:r>
+          <m:t>K</m:t>
+        </m:r>
+      </m:oMath>
+      <w:r>
+        <w:t xml:space="preserve"> </w:t>
+      </w:r>
+      <w:r>
+        <w:t xml:space="preserve">in computing time.</w:t>
+      </w:r>
+    </w:p>
+    <w:p>
+      <w:pPr>
+        <w:pStyle w:val="BlockText"/>
+      </w:pPr>
+      <w:r>
+        <w:t xml:space="preserve">✅ Nesting the cross-validation loop multiplies the computing time by</w:t>
+      </w:r>
+      <w:r>
+        <w:t xml:space="preserve"> </w:t>
+      </w:r>
+      <m:oMath>
+        <m:r>
+          <m:t>K</m:t>
+        </m:r>
+      </m:oMath>
+      <w:r>
+        <w:t xml:space="preserve">.</w:t>
+      </w:r>
+    </w:p>
+    <w:p>
+      <w:pPr>
+        <w:pStyle w:val="BlockText"/>
+      </w:pPr>
+      <w:r>
+        <w:t xml:space="preserve">❌ Continuity buys us the intermediate value theorem.</w:t>
+      </w:r>
+    </w:p>
+    <w:p>
+      <w:pPr>
+        <w:pStyle w:val="BlockText"/>
+      </w:pPr>
+      <w:r>
+        <w:t xml:space="preserve">✅ Continuity gives us the intermediate value theorem.</w:t>
+      </w:r>
+    </w:p>
+    <w:p>
+      <w:pPr>
+        <w:pStyle w:val="BlockText"/>
+      </w:pPr>
+      <w:r>
+        <w:t xml:space="preserve">❌ The penalty costs us a little flexibility at the ends of the curve.</w:t>
+      </w:r>
+    </w:p>
+    <w:p>
+      <w:pPr>
+        <w:pStyle w:val="BlockText"/>
+      </w:pPr>
+      <w:r>
+        <w:t xml:space="preserve">✅ The penalty reduces the curve’s flexibility a little at its ends.</w:t>
+      </w:r>
+    </w:p>
+    <w:p>
+      <w:pPr>
+        <w:pStyle w:val="FirstParagraph"/>
       </w:pPr>
       <w:r>
         <w:t xml:space="preserve">Some single words cause a different problem.</w:t>

</xml_diff>

<commit_message>
Deploying to gh-pages from @ Morrison-Lab/psw@bdac191ab864e9c2c1b93365c339cb2666d92ff2 🚀
</commit_message>
<xml_diff>
--- a/chapters/word-choice.docx
+++ b/chapters/word-choice.docx
@@ -15,7 +15,7 @@
         <w:pStyle w:val="Date"/>
       </w:pPr>
       <w:r>
-        <w:t xml:space="preserve">Last modified: 2026-10-16 03:42:31 (PDT)</w:t>
+        <w:t xml:space="preserve">Last modified: 2026-10-16 04:14:45 (PDT)</w:t>
       </w:r>
     </w:p>
     <w:tbl>
@@ -1472,13 +1472,13 @@
       </w:r>
     </w:p>
     <w:bookmarkEnd w:id="22"/>
-    <w:bookmarkStart w:id="25" w:name="minimize-unnecessary-jargon"/>
+    <w:bookmarkStart w:id="24" w:name="choose-each-preposition-on-purpose"/>
     <w:p>
       <w:pPr>
         <w:pStyle w:val="Heading2"/>
       </w:pPr>
       <w:r>
-        <w:t xml:space="preserve">4 Minimize unnecessary jargon</w:t>
+        <w:t xml:space="preserve">4 Choose each preposition on purpose</w:t>
       </w:r>
     </w:p>
     <w:p>
@@ -1486,6 +1486,322 @@
         <w:pStyle w:val="FirstParagraph"/>
       </w:pPr>
       <w:r>
+        <w:t xml:space="preserve">A preposition states a relationship between two things.</w:t>
+      </w:r>
+      <w:r>
+        <w:t xml:space="preserve"> </w:t>
+      </w:r>
+      <w:r>
+        <w:t xml:space="preserve">Small words such as</w:t>
+      </w:r>
+      <w:r>
+        <w:t xml:space="preserve"> </w:t>
+      </w:r>
+      <w:r>
+        <w:rPr>
+          <w:i/>
+          <w:iCs/>
+        </w:rPr>
+        <w:t xml:space="preserve">of</w:t>
+      </w:r>
+      <w:r>
+        <w:t xml:space="preserve">,</w:t>
+      </w:r>
+      <w:r>
+        <w:t xml:space="preserve"> </w:t>
+      </w:r>
+      <w:r>
+        <w:rPr>
+          <w:i/>
+          <w:iCs/>
+        </w:rPr>
+        <w:t xml:space="preserve">for</w:t>
+      </w:r>
+      <w:r>
+        <w:t xml:space="preserve">,</w:t>
+      </w:r>
+      <w:r>
+        <w:t xml:space="preserve"> </w:t>
+      </w:r>
+      <w:r>
+        <w:rPr>
+          <w:i/>
+          <w:iCs/>
+        </w:rPr>
+        <w:t xml:space="preserve">with</w:t>
+      </w:r>
+      <w:r>
+        <w:t xml:space="preserve"> </w:t>
+      </w:r>
+      <w:r>
+        <w:t xml:space="preserve">and</w:t>
+      </w:r>
+      <w:r>
+        <w:t xml:space="preserve"> </w:t>
+      </w:r>
+      <w:r>
+        <w:rPr>
+          <w:i/>
+          <w:iCs/>
+        </w:rPr>
+        <w:t xml:space="preserve">using</w:t>
+      </w:r>
+      <w:r>
+        <w:t xml:space="preserve"> </w:t>
+      </w:r>
+      <w:r>
+        <w:t xml:space="preserve">are easy to reach for by reflex,</w:t>
+      </w:r>
+      <w:r>
+        <w:t xml:space="preserve"> </w:t>
+      </w:r>
+      <w:r>
+        <w:t xml:space="preserve">and each one can stand for many different relationships</w:t>
+      </w:r>
+      <w:r>
+        <w:t xml:space="preserve"> </w:t>
+      </w:r>
+      <w:r>
+        <w:t xml:space="preserve">(ownership, purpose, cause, part and whole, tool, source).</w:t>
+      </w:r>
+      <w:r>
+        <w:t xml:space="preserve"> </w:t>
+      </w:r>
+      <w:r>
+        <w:t xml:space="preserve">When the sentence does not say which relationship it means,</w:t>
+      </w:r>
+      <w:r>
+        <w:t xml:space="preserve"> </w:t>
+      </w:r>
+      <w:r>
+        <w:t xml:space="preserve">the reader has to guess.</w:t>
+      </w:r>
+      <w:r>
+        <w:t xml:space="preserve"> </w:t>
+      </w:r>
+      <w:r>
+        <w:t xml:space="preserve">Readers who are learning English, and readers who read literally, guess worst.</w:t>
+      </w:r>
+    </w:p>
+    <w:p>
+      <w:pPr>
+        <w:pStyle w:val="BodyText"/>
+      </w:pPr>
+      <w:r>
+        <w:t xml:space="preserve">For each preposition, ask what relationship it states.</w:t>
+      </w:r>
+      <w:r>
+        <w:t xml:space="preserve"> </w:t>
+      </w:r>
+      <w:r>
+        <w:t xml:space="preserve">If you cannot answer in one phrase, replace it with a verb that names the relationship.</w:t>
+      </w:r>
+    </w:p>
+    <w:bookmarkStart w:id="23" w:name="exm-prepositions"/>
+    <w:p>
+      <w:pPr>
+        <w:pStyle w:val="BodyText"/>
+      </w:pPr>
+      <w:r>
+        <w:rPr>
+          <w:b/>
+          <w:bCs/>
+        </w:rPr>
+        <w:t xml:space="preserve">Example 1 (Naming the relationship)</w:t>
+      </w:r>
+      <w:r>
+        <w:t xml:space="preserve"> </w:t>
+      </w:r>
+      <w:r>
+        <w:t xml:space="preserve"> </w:t>
+      </w:r>
+    </w:p>
+    <w:p>
+      <w:pPr>
+        <w:pStyle w:val="BlockText"/>
+      </w:pPr>
+      <w:r>
+        <w:t xml:space="preserve">❌ The error of the prediction is large.</w:t>
+      </w:r>
+    </w:p>
+    <w:p>
+      <w:pPr>
+        <w:pStyle w:val="BlockText"/>
+      </w:pPr>
+      <w:r>
+        <w:t xml:space="preserve">✅ The prediction misses the observed outcome by a large amount.</w:t>
+      </w:r>
+    </w:p>
+    <w:p>
+      <w:pPr>
+        <w:pStyle w:val="FirstParagraph"/>
+      </w:pPr>
+      <w:r>
+        <w:rPr>
+          <w:i/>
+          <w:iCs/>
+        </w:rPr>
+        <w:t xml:space="preserve">Of</w:t>
+      </w:r>
+      <w:r>
+        <w:t xml:space="preserve"> </w:t>
+      </w:r>
+      <w:r>
+        <w:t xml:space="preserve">could mean the error the prediction makes,</w:t>
+      </w:r>
+      <w:r>
+        <w:t xml:space="preserve"> </w:t>
+      </w:r>
+      <w:r>
+        <w:t xml:space="preserve">the error in the way it was computed,</w:t>
+      </w:r>
+      <w:r>
+        <w:t xml:space="preserve"> </w:t>
+      </w:r>
+      <w:r>
+        <w:t xml:space="preserve">or an error that belongs to the prediction in some other way.</w:t>
+      </w:r>
+      <w:r>
+        <w:t xml:space="preserve"> </w:t>
+      </w:r>
+      <w:r>
+        <w:t xml:space="preserve">The verb</w:t>
+      </w:r>
+      <w:r>
+        <w:t xml:space="preserve"> </w:t>
+      </w:r>
+      <w:r>
+        <w:rPr>
+          <w:i/>
+          <w:iCs/>
+        </w:rPr>
+        <w:t xml:space="preserve">misses</w:t>
+      </w:r>
+      <w:r>
+        <w:t xml:space="preserve"> </w:t>
+      </w:r>
+      <w:r>
+        <w:t xml:space="preserve">says which.</w:t>
+      </w:r>
+    </w:p>
+    <w:p>
+      <w:pPr>
+        <w:pStyle w:val="BlockText"/>
+      </w:pPr>
+      <w:r>
+        <w:t xml:space="preserve">❌ We fit the model for the training set.</w:t>
+      </w:r>
+    </w:p>
+    <w:p>
+      <w:pPr>
+        <w:pStyle w:val="BlockText"/>
+      </w:pPr>
+      <w:r>
+        <w:t xml:space="preserve">✅ We estimate the model’s coefficients from the training set.</w:t>
+      </w:r>
+    </w:p>
+    <w:p>
+      <w:pPr>
+        <w:pStyle w:val="FirstParagraph"/>
+      </w:pPr>
+      <w:r>
+        <w:rPr>
+          <w:i/>
+          <w:iCs/>
+        </w:rPr>
+        <w:t xml:space="preserve">For</w:t>
+      </w:r>
+      <w:r>
+        <w:t xml:space="preserve"> </w:t>
+      </w:r>
+      <w:r>
+        <w:t xml:space="preserve">could mean on behalf of, in order to serve, or using.</w:t>
+      </w:r>
+      <w:r>
+        <w:t xml:space="preserve"> </w:t>
+      </w:r>
+      <w:r>
+        <w:rPr>
+          <w:i/>
+          <w:iCs/>
+        </w:rPr>
+        <w:t xml:space="preserve">From</w:t>
+      </w:r>
+      <w:r>
+        <w:t xml:space="preserve"> </w:t>
+      </w:r>
+      <w:r>
+        <w:t xml:space="preserve">states the relationship exactly:</w:t>
+      </w:r>
+      <w:r>
+        <w:t xml:space="preserve"> </w:t>
+      </w:r>
+      <w:r>
+        <w:t xml:space="preserve">the training set is the source of the estimates.</w:t>
+      </w:r>
+    </w:p>
+    <w:bookmarkEnd w:id="23"/>
+    <w:p>
+      <w:pPr>
+        <w:pStyle w:val="BodyText"/>
+      </w:pPr>
+      <w:r>
+        <w:t xml:space="preserve">Keep a plain preposition when it states the relationship exactly,</w:t>
+      </w:r>
+      <w:r>
+        <w:t xml:space="preserve"> </w:t>
+      </w:r>
+      <w:r>
+        <w:t xml:space="preserve">such as</w:t>
+      </w:r>
+      <w:r>
+        <w:t xml:space="preserve"> </w:t>
+      </w:r>
+      <w:r>
+        <w:rPr>
+          <w:i/>
+          <w:iCs/>
+        </w:rPr>
+        <w:t xml:space="preserve">in</w:t>
+      </w:r>
+      <w:r>
+        <w:t xml:space="preserve"> </w:t>
+      </w:r>
+      <w:r>
+        <w:t xml:space="preserve">for location and</w:t>
+      </w:r>
+      <w:r>
+        <w:t xml:space="preserve"> </w:t>
+      </w:r>
+      <w:r>
+        <w:rPr>
+          <w:i/>
+          <w:iCs/>
+        </w:rPr>
+        <w:t xml:space="preserve">by</w:t>
+      </w:r>
+      <w:r>
+        <w:t xml:space="preserve"> </w:t>
+      </w:r>
+      <w:r>
+        <w:t xml:space="preserve">for the agent of a passive verb.</w:t>
+      </w:r>
+    </w:p>
+    <w:bookmarkEnd w:id="24"/>
+    <w:bookmarkStart w:id="27" w:name="minimize-unnecessary-jargon"/>
+    <w:p>
+      <w:pPr>
+        <w:pStyle w:val="Heading2"/>
+      </w:pPr>
+      <w:r>
+        <w:t xml:space="preserve">5 Minimize unnecessary jargon</w:t>
+      </w:r>
+    </w:p>
+    <w:p>
+      <w:pPr>
+        <w:pStyle w:val="FirstParagraph"/>
+      </w:pPr>
+      <w:r>
         <w:t xml:space="preserve">Jargon is vocabulary specific to a field.</w:t>
       </w:r>
       <w:r>
@@ -1583,7 +1899,7 @@
       <w:r>
         <w:t xml:space="preserve"> </w:t>
       </w:r>
-      <w:hyperlink r:id="rId23">
+      <w:hyperlink r:id="rId25">
         <w:r>
           <w:rPr>
             <w:rStyle w:val="Hyperlink"/>
@@ -1595,7 +1911,7 @@
         <w:t xml:space="preserve">).</w:t>
       </w:r>
     </w:p>
-    <w:bookmarkStart w:id="24" w:name="exm-jargon"/>
+    <w:bookmarkStart w:id="26" w:name="exm-jargon"/>
     <w:p>
       <w:pPr>
         <w:pStyle w:val="BodyText"/>
@@ -1605,7 +1921,7 @@
           <w:b/>
           <w:bCs/>
         </w:rPr>
-        <w:t xml:space="preserve">Example 1 (Replacing unnecessary jargon)</w:t>
+        <w:t xml:space="preserve">Example 2 (Replacing unnecessary jargon)</w:t>
       </w:r>
       <w:r>
         <w:t xml:space="preserve"> </w:t>
@@ -1644,7 +1960,7 @@
         <w:t xml:space="preserve">and it states what was actually done.</w:t>
       </w:r>
     </w:p>
-    <w:bookmarkEnd w:id="24"/>
+    <w:bookmarkEnd w:id="26"/>
     <w:p>
       <w:pPr>
         <w:pStyle w:val="BodyText"/>
@@ -1683,7 +1999,7 @@
         <w:t xml:space="preserve">define it clearly at first use.</w:t>
       </w:r>
     </w:p>
-    <w:bookmarkEnd w:id="25"/>
+    <w:bookmarkEnd w:id="27"/>
     <w:sectPr>
       <w:footnotePr>
         <w:numRestart w:val="eachSect"/>

</xml_diff>

<commit_message>
Deploying to gh-pages from @ Morrison-Lab/psw@e25f2b05c7d857d53fb9b0c39770278d978e640a 🚀
</commit_message>
<xml_diff>
--- a/chapters/word-choice.docx
+++ b/chapters/word-choice.docx
@@ -15,7 +15,7 @@
         <w:pStyle w:val="Date"/>
       </w:pPr>
       <w:r>
-        <w:t xml:space="preserve">Last modified: 2026-10-19 02:57:24 (PDT)</w:t>
+        <w:t xml:space="preserve">Last modified: 2026-10-19 03:32:07 (PDT)</w:t>
       </w:r>
     </w:p>
     <w:tbl>
@@ -1472,13 +1472,165 @@
       </w:r>
     </w:p>
     <w:bookmarkEnd w:id="22"/>
-    <w:bookmarkStart w:id="24" w:name="choose-each-preposition-on-purpose"/>
+    <w:bookmarkStart w:id="24" w:name="write-the-full-phrase"/>
     <w:p>
       <w:pPr>
         <w:pStyle w:val="Heading2"/>
       </w:pPr>
       <w:r>
-        <w:t xml:space="preserve">4 Choose each preposition on purpose</w:t>
+        <w:t xml:space="preserve">4 Write the full phrase</w:t>
+      </w:r>
+    </w:p>
+    <w:p>
+      <w:pPr>
+        <w:pStyle w:val="FirstParagraph"/>
+      </w:pPr>
+      <w:r>
+        <w:t xml:space="preserve">Do not leave out words the phrase needs to be complete.</w:t>
+      </w:r>
+      <w:r>
+        <w:t xml:space="preserve"> </w:t>
+      </w:r>
+      <w:r>
+        <w:t xml:space="preserve">A clipped phrase such as</w:t>
+      </w:r>
+      <w:r>
+        <w:t xml:space="preserve"> </w:t>
+      </w:r>
+      <w:r>
+        <w:t xml:space="preserve">“the true mean function”</w:t>
+      </w:r>
+      <w:r>
+        <w:t xml:space="preserve"> </w:t>
+      </w:r>
+      <w:r>
+        <w:t xml:space="preserve">asks the reader to supply the missing words,</w:t>
+      </w:r>
+      <w:r>
+        <w:t xml:space="preserve"> </w:t>
+      </w:r>
+      <w:r>
+        <w:t xml:space="preserve">and the reader may supply different ones than you meant.</w:t>
+      </w:r>
+      <w:r>
+        <w:t xml:space="preserve"> </w:t>
+      </w:r>
+      <w:r>
+        <w:t xml:space="preserve">Readers who are learning English, and readers who read literally, cannot always recover them.</w:t>
+      </w:r>
+      <w:r>
+        <w:t xml:space="preserve"> </w:t>
+      </w:r>
+      <w:r>
+        <w:t xml:space="preserve">Name what the object is a function of, and what it is conditional on.</w:t>
+      </w:r>
+    </w:p>
+    <w:p>
+      <w:pPr>
+        <w:pStyle w:val="BodyText"/>
+      </w:pPr>
+      <w:r>
+        <w:t xml:space="preserve">The same rule applies to symbols.</w:t>
+      </w:r>
+      <w:r>
+        <w:t xml:space="preserve"> </w:t>
+      </w:r>
+      <w:r>
+        <w:t xml:space="preserve">Write a function with its argument, such as</w:t>
+      </w:r>
+      <w:r>
+        <w:t xml:space="preserve"> </w:t>
+      </w:r>
+      <w:r>
+        <w:t xml:space="preserve">$\truemeanf{\predvar}$</w:t>
+      </w:r>
+      <w:r>
+        <w:t xml:space="preserve">, not the bare function name,</w:t>
+      </w:r>
+      <w:r>
+        <w:t xml:space="preserve"> </w:t>
+      </w:r>
+      <w:r>
+        <w:t xml:space="preserve">unless the sentence is about the function as a whole and the page has said so.</w:t>
+      </w:r>
+      <w:r>
+        <w:t xml:space="preserve"> </w:t>
+      </w:r>
+      <w:r>
+        <w:t xml:space="preserve">A symbol in a sentence should look like the same symbol in the display equation it refers to.</w:t>
+      </w:r>
+    </w:p>
+    <w:bookmarkStart w:id="23" w:name="exm-full-phrase"/>
+    <w:p>
+      <w:pPr>
+        <w:pStyle w:val="BodyText"/>
+      </w:pPr>
+      <w:r>
+        <w:rPr>
+          <w:b/>
+          <w:bCs/>
+        </w:rPr>
+        <w:t xml:space="preserve">Example 1 (Writing the full phrase and the argument)</w:t>
+      </w:r>
+      <w:r>
+        <w:t xml:space="preserve"> </w:t>
+      </w:r>
+      <w:r>
+        <w:t xml:space="preserve">The display equation is</w:t>
+      </w:r>
+      <w:r>
+        <w:t xml:space="preserve"> </w:t>
+      </w:r>
+      <w:r>
+        <w:t xml:space="preserve">$\Outvar = \truemeanf{\predvar} + \noise$</w:t>
+      </w:r>
+      <w:r>
+        <w:t xml:space="preserve">.</w:t>
+      </w:r>
+    </w:p>
+    <w:p>
+      <w:pPr>
+        <w:pStyle w:val="BlockText"/>
+      </w:pPr>
+      <w:r>
+        <w:t xml:space="preserve">❌ The outcome variable is the true mean function plus noise.</w:t>
+      </w:r>
+    </w:p>
+    <w:p>
+      <w:pPr>
+        <w:pStyle w:val="BlockText"/>
+      </w:pPr>
+      <w:r>
+        <w:t xml:space="preserve">✅ The outcome variable is the true mean function of the outcome variable given the input value</w:t>
+      </w:r>
+      <w:r>
+        <w:t xml:space="preserve"> </w:t>
+      </w:r>
+      <w:r>
+        <w:t xml:space="preserve">$\predvar$</w:t>
+      </w:r>
+      <w:r>
+        <w:t xml:space="preserve">, namely</w:t>
+      </w:r>
+      <w:r>
+        <w:t xml:space="preserve"> </w:t>
+      </w:r>
+      <w:r>
+        <w:t xml:space="preserve">$\truemeanf{\predvar}$</w:t>
+      </w:r>
+      <w:r>
+        <w:t xml:space="preserve">, plus noise.</w:t>
+      </w:r>
+    </w:p>
+    <w:bookmarkEnd w:id="23"/>
+    <w:bookmarkEnd w:id="24"/>
+    <w:bookmarkStart w:id="26" w:name="choose-each-preposition-on-purpose"/>
+    <w:p>
+      <w:pPr>
+        <w:pStyle w:val="Heading2"/>
+      </w:pPr>
+      <w:r>
+        <w:t xml:space="preserve">5 Choose each preposition on purpose</w:t>
       </w:r>
     </w:p>
     <w:p>
@@ -1597,7 +1749,7 @@
         <w:t xml:space="preserve">If you cannot answer in one phrase, replace it with a verb that names the relationship.</w:t>
       </w:r>
     </w:p>
-    <w:bookmarkStart w:id="23" w:name="exm-prepositions"/>
+    <w:bookmarkStart w:id="25" w:name="exm-prepositions"/>
     <w:p>
       <w:pPr>
         <w:pStyle w:val="BodyText"/>
@@ -1607,7 +1759,7 @@
           <w:b/>
           <w:bCs/>
         </w:rPr>
-        <w:t xml:space="preserve">Example 1 (Naming the relationship)</w:t>
+        <w:t xml:space="preserve">Example 2 (Naming the relationship)</w:t>
       </w:r>
       <w:r>
         <w:t xml:space="preserve"> </w:t>
@@ -1740,7 +1892,7 @@
         <w:t xml:space="preserve">the training set is the source of the estimates.</w:t>
       </w:r>
     </w:p>
-    <w:bookmarkEnd w:id="23"/>
+    <w:bookmarkEnd w:id="25"/>
     <w:p>
       <w:pPr>
         <w:pStyle w:val="BodyText"/>
@@ -1787,14 +1939,14 @@
         <w:t xml:space="preserve">for the agent of a passive verb.</w:t>
       </w:r>
     </w:p>
-    <w:bookmarkEnd w:id="24"/>
-    <w:bookmarkStart w:id="27" w:name="minimize-unnecessary-jargon"/>
+    <w:bookmarkEnd w:id="26"/>
+    <w:bookmarkStart w:id="29" w:name="minimize-unnecessary-jargon"/>
     <w:p>
       <w:pPr>
         <w:pStyle w:val="Heading2"/>
       </w:pPr>
       <w:r>
-        <w:t xml:space="preserve">5 Minimize unnecessary jargon</w:t>
+        <w:t xml:space="preserve">6 Minimize unnecessary jargon</w:t>
       </w:r>
     </w:p>
     <w:p>
@@ -1899,7 +2051,7 @@
       <w:r>
         <w:t xml:space="preserve"> </w:t>
       </w:r>
-      <w:hyperlink r:id="rId25">
+      <w:hyperlink r:id="rId27">
         <w:r>
           <w:rPr>
             <w:rStyle w:val="Hyperlink"/>
@@ -1911,7 +2063,7 @@
         <w:t xml:space="preserve">).</w:t>
       </w:r>
     </w:p>
-    <w:bookmarkStart w:id="26" w:name="exm-jargon"/>
+    <w:bookmarkStart w:id="28" w:name="exm-jargon"/>
     <w:p>
       <w:pPr>
         <w:pStyle w:val="BodyText"/>
@@ -1921,7 +2073,7 @@
           <w:b/>
           <w:bCs/>
         </w:rPr>
-        <w:t xml:space="preserve">Example 2 (Replacing unnecessary jargon)</w:t>
+        <w:t xml:space="preserve">Example 3 (Replacing unnecessary jargon)</w:t>
       </w:r>
       <w:r>
         <w:t xml:space="preserve"> </w:t>
@@ -1960,7 +2112,7 @@
         <w:t xml:space="preserve">and it states what was actually done.</w:t>
       </w:r>
     </w:p>
-    <w:bookmarkEnd w:id="26"/>
+    <w:bookmarkEnd w:id="28"/>
     <w:p>
       <w:pPr>
         <w:pStyle w:val="BodyText"/>
@@ -1999,7 +2151,7 @@
         <w:t xml:space="preserve">define it clearly at first use.</w:t>
       </w:r>
     </w:p>
-    <w:bookmarkEnd w:id="27"/>
+    <w:bookmarkEnd w:id="29"/>
     <w:sectPr>
       <w:footnotePr>
         <w:numRestart w:val="eachSect"/>

</xml_diff>

<commit_message>
Deploying to gh-pages from @ Morrison-Lab/psw@fdd6d6dda843cc5391f20e4ba7707de508252842 🚀
</commit_message>
<xml_diff>
--- a/chapters/word-choice.docx
+++ b/chapters/word-choice.docx
@@ -15,7 +15,7 @@
         <w:pStyle w:val="Date"/>
       </w:pPr>
       <w:r>
-        <w:t xml:space="preserve">Last modified: 2026-10-29 15:44:03 (PDT)</w:t>
+        <w:t xml:space="preserve">Last modified: 2026-10-29 16:45:39 (PDT)</w:t>
       </w:r>
     </w:p>
     <w:tbl>
@@ -618,7 +618,7 @@
         <w:t xml:space="preserve">and the relatively-recent hybridization of the English language.</w:t>
       </w:r>
     </w:p>
-    <w:bookmarkStart w:id="25" w:name="avoid-vague-and-metaphorical-language"/>
+    <w:bookmarkStart w:id="29" w:name="avoid-vague-and-metaphorical-language"/>
     <w:p>
       <w:pPr>
         <w:pStyle w:val="Heading2"/>
@@ -1589,6 +1589,286 @@
         <w:pStyle w:val="FirstParagraph"/>
       </w:pPr>
       <w:r>
+        <w:t xml:space="preserve">Be as specific as feasible.</w:t>
+      </w:r>
+      <w:r>
+        <w:t xml:space="preserve"> </w:t>
+      </w:r>
+      <w:r>
+        <w:t xml:space="preserve">When the text has a specific object, name it,</w:t>
+      </w:r>
+      <w:r>
+        <w:t xml:space="preserve"> </w:t>
+      </w:r>
+      <w:r>
+        <w:t xml:space="preserve">and do not let a generic placeholder stand in for it,</w:t>
+      </w:r>
+      <w:r>
+        <w:t xml:space="preserve"> </w:t>
+      </w:r>
+      <w:r>
+        <w:t xml:space="preserve">such as</w:t>
+      </w:r>
+      <w:r>
+        <w:t xml:space="preserve"> </w:t>
+      </w:r>
+      <w:r>
+        <w:t xml:space="preserve">“some set”</w:t>
+      </w:r>
+      <w:r>
+        <w:t xml:space="preserve">,</w:t>
+      </w:r>
+      <w:r>
+        <w:t xml:space="preserve"> </w:t>
+      </w:r>
+      <w:r>
+        <w:t xml:space="preserve">“a set A”</w:t>
+      </w:r>
+      <w:r>
+        <w:t xml:space="preserve"> </w:t>
+      </w:r>
+      <w:r>
+        <w:t xml:space="preserve">or</w:t>
+      </w:r>
+      <w:r>
+        <w:t xml:space="preserve"> </w:t>
+      </w:r>
+      <w:r>
+        <w:t xml:space="preserve">“the object”</w:t>
+      </w:r>
+      <w:r>
+        <w:t xml:space="preserve">.</w:t>
+      </w:r>
+      <w:r>
+        <w:t xml:space="preserve"> </w:t>
+      </w:r>
+      <w:r>
+        <w:t xml:space="preserve">A placeholder makes the reader ask which set is meant,</w:t>
+      </w:r>
+      <w:r>
+        <w:t xml:space="preserve"> </w:t>
+      </w:r>
+      <w:r>
+        <w:t xml:space="preserve">and the writer has already answered that question.</w:t>
+      </w:r>
+      <w:r>
+        <w:t xml:space="preserve"> </w:t>
+      </w:r>
+      <w:r>
+        <w:t xml:space="preserve">Keep a placeholder only where the statement is abstract on purpose,</w:t>
+      </w:r>
+      <w:r>
+        <w:t xml:space="preserve"> </w:t>
+      </w:r>
+      <w:r>
+        <w:t xml:space="preserve">such as a general definition that holds for any set.</w:t>
+      </w:r>
+      <w:r>
+        <w:t xml:space="preserve"> </w:t>
+      </w:r>
+      <w:r>
+        <w:t xml:space="preserve">The same aim, stated from the other side:</w:t>
+      </w:r>
+      <w:r>
+        <w:t xml:space="preserve"> </w:t>
+      </w:r>
+      <w:r>
+        <w:t xml:space="preserve">state a result at the generality it holds,</w:t>
+      </w:r>
+      <w:r>
+        <w:t xml:space="preserve"> </w:t>
+      </w:r>
+      <w:r>
+        <w:t xml:space="preserve">no narrower than its argument needs.</w:t>
+      </w:r>
+      <w:r>
+        <w:t xml:space="preserve"> </w:t>
+      </w:r>
+      <w:r>
+        <w:t xml:space="preserve">A fact that a proof proves only for one case,</w:t>
+      </w:r>
+      <w:r>
+        <w:t xml:space="preserve"> </w:t>
+      </w:r>
+      <w:r>
+        <w:t xml:space="preserve">when the argument works for all cases,</w:t>
+      </w:r>
+      <w:r>
+        <w:t xml:space="preserve"> </w:t>
+      </w:r>
+      <w:r>
+        <w:t xml:space="preserve">is a lemma left unextracted</w:t>
+      </w:r>
+      <w:r>
+        <w:t xml:space="preserve"> </w:t>
+      </w:r>
+      <w:r>
+        <w:t xml:space="preserve">(</w:t>
+      </w:r>
+      <w:hyperlink r:id="rId24">
+        <w:r>
+          <w:rPr>
+            <w:rStyle w:val="Hyperlink"/>
+          </w:rPr>
+          <w:t xml:space="preserve">Extract a lemma wherever feasible</w:t>
+        </w:r>
+      </w:hyperlink>
+      <w:r>
+        <w:t xml:space="preserve">).</w:t>
+      </w:r>
+    </w:p>
+    <w:p>
+      <w:pPr>
+        <w:pStyle w:val="BlockText"/>
+      </w:pPr>
+      <w:r>
+        <w:t xml:space="preserve">❌ The mode is an element of the set A at which the density is largest.</w:t>
+      </w:r>
+    </w:p>
+    <w:p>
+      <w:pPr>
+        <w:pStyle w:val="BlockText"/>
+      </w:pPr>
+      <w:r>
+        <w:t xml:space="preserve">✅ The mode is an element of the</w:t>
+      </w:r>
+      <w:r>
+        <w:t xml:space="preserve"> </w:t>
+      </w:r>
+      <w:hyperlink r:id="rId25">
+        <w:r>
+          <w:rPr>
+            <w:rStyle w:val="Hyperlink"/>
+          </w:rPr>
+          <w:t xml:space="preserve">range</w:t>
+        </w:r>
+      </w:hyperlink>
+      <w:r>
+        <w:t xml:space="preserve"> </w:t>
+      </w:r>
+      <w:r>
+        <w:t xml:space="preserve">of the random variable at which the density is largest.</w:t>
+      </w:r>
+    </w:p>
+    <w:p>
+      <w:pPr>
+        <w:pStyle w:val="FirstParagraph"/>
+      </w:pPr>
+      <w:r>
+        <w:t xml:space="preserve">The</w:t>
+      </w:r>
+      <w:r>
+        <w:t xml:space="preserve"> </w:t>
+      </w:r>
+      <w:r>
+        <w:rPr>
+          <w:rStyle w:val="VerbatimChar"/>
+        </w:rPr>
+        <w:t xml:space="preserve">check-avoided-words</w:t>
+      </w:r>
+      <w:r>
+        <w:t xml:space="preserve"> </w:t>
+      </w:r>
+      <w:r>
+        <w:t xml:space="preserve">check in gha warns on</w:t>
+      </w:r>
+      <w:r>
+        <w:t xml:space="preserve"> </w:t>
+      </w:r>
+      <w:r>
+        <w:t xml:space="preserve">a</w:t>
+      </w:r>
+      <w:r>
+        <w:t xml:space="preserve"> </w:t>
+      </w:r>
+      <w:hyperlink r:id="rId26">
+        <w:r>
+          <w:rPr>
+            <w:rStyle w:val="Hyperlink"/>
+          </w:rPr>
+          <w:t xml:space="preserve">domain</w:t>
+        </w:r>
+      </w:hyperlink>
+      <w:r>
+        <w:t xml:space="preserve">,</w:t>
+      </w:r>
+      <w:r>
+        <w:t xml:space="preserve"> </w:t>
+      </w:r>
+      <w:hyperlink r:id="rId27">
+        <w:r>
+          <w:rPr>
+            <w:rStyle w:val="Hyperlink"/>
+          </w:rPr>
+          <w:t xml:space="preserve">codomain</w:t>
+        </w:r>
+      </w:hyperlink>
+      <w:r>
+        <w:t xml:space="preserve">,</w:t>
+      </w:r>
+      <w:r>
+        <w:t xml:space="preserve"> </w:t>
+      </w:r>
+      <w:r>
+        <w:t xml:space="preserve">range or sample space named by a bare capital letter or by</w:t>
+      </w:r>
+      <w:r>
+        <w:t xml:space="preserve"> </w:t>
+      </w:r>
+      <w:r>
+        <w:t xml:space="preserve">“some”</w:t>
+      </w:r>
+      <w:r>
+        <w:t xml:space="preserve">,</w:t>
+      </w:r>
+      <w:r>
+        <w:t xml:space="preserve"> </w:t>
+      </w:r>
+      <w:r>
+        <w:t xml:space="preserve"> </w:t>
+      </w:r>
+      <w:r>
+        <w:t xml:space="preserve">such as</w:t>
+      </w:r>
+      <w:r>
+        <w:t xml:space="preserve"> </w:t>
+      </w:r>
+      <w:r>
+        <w:t xml:space="preserve">“domain A”</w:t>
+      </w:r>
+      <w:r>
+        <w:t xml:space="preserve"> </w:t>
+      </w:r>
+      <w:r>
+        <w:t xml:space="preserve">or</w:t>
+      </w:r>
+      <w:r>
+        <w:t xml:space="preserve"> </w:t>
+      </w:r>
+      <w:r>
+        <w:t xml:space="preserve">“some range”</w:t>
+      </w:r>
+      <w:r>
+        <w:t xml:space="preserve">.</w:t>
+      </w:r>
+      <w:r>
+        <w:t xml:space="preserve"> </w:t>
+      </w:r>
+      <w:r>
+        <w:t xml:space="preserve">It cannot tell whether a specific object exists,</w:t>
+      </w:r>
+      <w:r>
+        <w:t xml:space="preserve"> </w:t>
+      </w:r>
+      <w:r>
+        <w:t xml:space="preserve">so a warning only asks you to check.</w:t>
+      </w:r>
+    </w:p>
+    <w:p>
+      <w:pPr>
+        <w:pStyle w:val="BodyText"/>
+      </w:pPr>
+      <w:r>
         <w:t xml:space="preserve">Some single words cause a different problem.</w:t>
       </w:r>
       <w:r>
@@ -1639,7 +1919,7 @@
       <w:r>
         <w:t xml:space="preserve"> </w:t>
       </w:r>
-      <w:hyperlink r:id="rId24">
+      <w:hyperlink r:id="rId28">
         <w:r>
           <w:rPr>
             <w:rStyle w:val="Hyperlink"/>
@@ -1660,8 +1940,8 @@
         <w:t xml:space="preserve">and what to write instead.</w:t>
       </w:r>
     </w:p>
-    <w:bookmarkEnd w:id="25"/>
-    <w:bookmarkStart w:id="26" w:name="Xb7f284656303a61435fb977954db81f2a003d22"/>
+    <w:bookmarkEnd w:id="29"/>
+    <w:bookmarkStart w:id="30" w:name="Xb7f284656303a61435fb977954db81f2a003d22"/>
     <w:p>
       <w:pPr>
         <w:pStyle w:val="Heading2"/>
@@ -1796,8 +2076,8 @@
         <w:t xml:space="preserve">and put that case right after the claim.</w:t>
       </w:r>
     </w:p>
-    <w:bookmarkEnd w:id="26"/>
-    <w:bookmarkStart w:id="27" w:name="say-which-thing"/>
+    <w:bookmarkEnd w:id="30"/>
+    <w:bookmarkStart w:id="31" w:name="say-which-thing"/>
     <w:p>
       <w:pPr>
         <w:pStyle w:val="Heading2"/>
@@ -1938,8 +2218,8 @@
         <w:t xml:space="preserve">the sentence is not yet ready to write.</w:t>
       </w:r>
     </w:p>
-    <w:bookmarkEnd w:id="27"/>
-    <w:bookmarkStart w:id="29" w:name="give-a-technical-word-one-meaning"/>
+    <w:bookmarkEnd w:id="31"/>
+    <w:bookmarkStart w:id="33" w:name="give-a-technical-word-one-meaning"/>
     <w:p>
       <w:pPr>
         <w:pStyle w:val="Heading2"/>
@@ -2032,7 +2312,7 @@
       <w:r>
         <w:t xml:space="preserve"> </w:t>
       </w:r>
-      <w:hyperlink r:id="rId28">
+      <w:hyperlink r:id="rId32">
         <w:r>
           <w:rPr>
             <w:rStyle w:val="Hyperlink"/>
@@ -2139,8 +2419,8 @@
         <w:t xml:space="preserve">.</w:t>
       </w:r>
     </w:p>
-    <w:bookmarkEnd w:id="29"/>
-    <w:bookmarkStart w:id="30" w:name="name-a-quantity-for-what-it-is"/>
+    <w:bookmarkEnd w:id="33"/>
+    <w:bookmarkStart w:id="34" w:name="name-a-quantity-for-what-it-is"/>
     <w:p>
       <w:pPr>
         <w:pStyle w:val="Heading2"/>
@@ -2359,8 +2639,8 @@
         <w:t xml:space="preserve">so this rule is enforced by review.</w:t>
       </w:r>
     </w:p>
-    <w:bookmarkEnd w:id="30"/>
-    <w:bookmarkStart w:id="32" w:name="write-the-full-phrase"/>
+    <w:bookmarkEnd w:id="34"/>
+    <w:bookmarkStart w:id="36" w:name="write-the-full-phrase"/>
     <w:p>
       <w:pPr>
         <w:pStyle w:val="Heading2"/>
@@ -2472,7 +2752,7 @@
         <w:t xml:space="preserve">A symbol in a sentence should look like the same symbol in the display equation it refers to.</w:t>
       </w:r>
     </w:p>
-    <w:bookmarkStart w:id="31" w:name="exm-full-phrase"/>
+    <w:bookmarkStart w:id="35" w:name="exm-full-phrase"/>
     <w:p>
       <w:pPr>
         <w:pStyle w:val="BodyText"/>
@@ -2599,9 +2879,9 @@
         <w:t xml:space="preserve">, plus noise.</w:t>
       </w:r>
     </w:p>
-    <w:bookmarkEnd w:id="31"/>
-    <w:bookmarkEnd w:id="32"/>
-    <w:bookmarkStart w:id="34" w:name="choose-each-preposition-on-purpose"/>
+    <w:bookmarkEnd w:id="35"/>
+    <w:bookmarkEnd w:id="36"/>
+    <w:bookmarkStart w:id="38" w:name="choose-each-preposition-on-purpose"/>
     <w:p>
       <w:pPr>
         <w:pStyle w:val="Heading2"/>
@@ -2726,7 +3006,7 @@
         <w:t xml:space="preserve">If you cannot answer in one phrase, replace it with a verb that names the relationship.</w:t>
       </w:r>
     </w:p>
-    <w:bookmarkStart w:id="33" w:name="exm-prepositions"/>
+    <w:bookmarkStart w:id="37" w:name="exm-prepositions"/>
     <w:p>
       <w:pPr>
         <w:pStyle w:val="BodyText"/>
@@ -2869,7 +3149,7 @@
         <w:t xml:space="preserve">the training set is the source of the estimates.</w:t>
       </w:r>
     </w:p>
-    <w:bookmarkEnd w:id="33"/>
+    <w:bookmarkEnd w:id="37"/>
     <w:p>
       <w:pPr>
         <w:pStyle w:val="BodyText"/>
@@ -2916,8 +3196,8 @@
         <w:t xml:space="preserve">for the agent of a passive verb.</w:t>
       </w:r>
     </w:p>
-    <w:bookmarkEnd w:id="34"/>
-    <w:bookmarkStart w:id="36" w:name="X1149ca6d49e4375cc24b5014956e62ef92d54a6"/>
+    <w:bookmarkEnd w:id="38"/>
+    <w:bookmarkStart w:id="40" w:name="X1149ca6d49e4375cc24b5014956e62ef92d54a6"/>
     <w:p>
       <w:pPr>
         <w:pStyle w:val="Heading2"/>
@@ -3087,7 +3367,7 @@
         <w:t xml:space="preserve">and survives a reordering.</w:t>
       </w:r>
     </w:p>
-    <w:bookmarkStart w:id="35" w:name="exm-position-words"/>
+    <w:bookmarkStart w:id="39" w:name="exm-position-words"/>
     <w:p>
       <w:pPr>
         <w:pStyle w:val="BodyText"/>
@@ -3233,9 +3513,9 @@
         <w:t xml:space="preserve">does not refer to a position in the document and is fine.</w:t>
       </w:r>
     </w:p>
-    <w:bookmarkEnd w:id="35"/>
-    <w:bookmarkEnd w:id="36"/>
-    <w:bookmarkStart w:id="37" w:name="X212ba9c0ec5aa092dffa1fb69c052daae98fcd9"/>
+    <w:bookmarkEnd w:id="39"/>
+    <w:bookmarkEnd w:id="40"/>
+    <w:bookmarkStart w:id="41" w:name="X212ba9c0ec5aa092dffa1fb69c052daae98fcd9"/>
     <w:p>
       <w:pPr>
         <w:pStyle w:val="Heading2"/>
@@ -3386,7 +3666,7 @@
       <w:r>
         <w:t xml:space="preserve"> </w:t>
       </w:r>
-      <w:hyperlink r:id="rId24">
+      <w:hyperlink r:id="rId28">
         <w:r>
           <w:rPr>
             <w:rStyle w:val="Hyperlink"/>
@@ -3460,8 +3740,8 @@
         <w:t xml:space="preserve">changes it.</w:t>
       </w:r>
     </w:p>
-    <w:bookmarkEnd w:id="37"/>
-    <w:bookmarkStart w:id="40" w:name="X49b806fcb01140a547354f51de69b452814bc12"/>
+    <w:bookmarkEnd w:id="41"/>
+    <w:bookmarkStart w:id="44" w:name="X49b806fcb01140a547354f51de69b452814bc12"/>
     <w:p>
       <w:pPr>
         <w:pStyle w:val="Heading2"/>
@@ -3630,7 +3910,7 @@
         <w:t xml:space="preserve">assumed an order of lectures that the page does not fix.</w:t>
       </w:r>
     </w:p>
-    <w:bookmarkStart w:id="39" w:name="exm-time-relative"/>
+    <w:bookmarkStart w:id="43" w:name="exm-time-relative"/>
     <w:p>
       <w:pPr>
         <w:pStyle w:val="BodyText"/>
@@ -3727,7 +4007,7 @@
       <w:r>
         <w:t xml:space="preserve"> </w:t>
       </w:r>
-      <w:hyperlink r:id="rId38">
+      <w:hyperlink r:id="rId42">
         <w:r>
           <w:rPr>
             <w:rStyle w:val="Hyperlink"/>
@@ -3742,9 +4022,9 @@
         <w:t xml:space="preserve">shows.</w:t>
       </w:r>
     </w:p>
-    <w:bookmarkEnd w:id="39"/>
-    <w:bookmarkEnd w:id="40"/>
-    <w:bookmarkStart w:id="46" w:name="minimize-unnecessary-jargon"/>
+    <w:bookmarkEnd w:id="43"/>
+    <w:bookmarkEnd w:id="44"/>
+    <w:bookmarkStart w:id="50" w:name="minimize-unnecessary-jargon"/>
     <w:p>
       <w:pPr>
         <w:pStyle w:val="Heading2"/>
@@ -3872,7 +4152,7 @@
       <w:r>
         <w:t xml:space="preserve"> </w:t>
       </w:r>
-      <w:hyperlink r:id="rId41">
+      <w:hyperlink r:id="rId45">
         <w:r>
           <w:rPr>
             <w:rStyle w:val="Hyperlink"/>
@@ -3884,7 +4164,7 @@
         <w:t xml:space="preserve">).</w:t>
       </w:r>
     </w:p>
-    <w:bookmarkStart w:id="42" w:name="exm-jargon"/>
+    <w:bookmarkStart w:id="46" w:name="exm-jargon"/>
     <w:p>
       <w:pPr>
         <w:pStyle w:val="BodyText"/>
@@ -3933,7 +4213,7 @@
         <w:t xml:space="preserve">and it states what was actually done.</w:t>
       </w:r>
     </w:p>
-    <w:bookmarkEnd w:id="42"/>
+    <w:bookmarkEnd w:id="46"/>
     <w:p>
       <w:pPr>
         <w:pStyle w:val="BodyText"/>
@@ -3972,8 +4252,8 @@
         <w:t xml:space="preserve">define it clearly at first use.</w:t>
       </w:r>
     </w:p>
-    <w:bookmarkStart w:id="45" w:name="refs"/>
-    <w:bookmarkStart w:id="44" w:name="ref-google2025style"/>
+    <w:bookmarkStart w:id="49" w:name="refs"/>
+    <w:bookmarkStart w:id="48" w:name="ref-google2025style"/>
     <w:p>
       <w:pPr>
         <w:pStyle w:val="Bibliography"/>
@@ -3997,7 +4277,7 @@
       <w:r>
         <w:t xml:space="preserve"> </w:t>
       </w:r>
-      <w:hyperlink r:id="rId43">
+      <w:hyperlink r:id="rId47">
         <w:r>
           <w:rPr>
             <w:rStyle w:val="Hyperlink"/>
@@ -4009,9 +4289,9 @@
         <w:t xml:space="preserve">.</w:t>
       </w:r>
     </w:p>
-    <w:bookmarkEnd w:id="44"/>
-    <w:bookmarkEnd w:id="45"/>
-    <w:bookmarkEnd w:id="46"/>
+    <w:bookmarkEnd w:id="48"/>
+    <w:bookmarkEnd w:id="49"/>
+    <w:bookmarkEnd w:id="50"/>
     <w:sectPr>
       <w:footnotePr>
         <w:numRestart w:val="eachSect"/>

</xml_diff>